<commit_message>
3LD: Add code for new functions + formatted outputting of results, add 3LD report, style fixes for 2LD
</commit_message>
<xml_diff>
--- a/2LD/2LD.docx
+++ b/2LD/2LD.docx
@@ -1954,7 +1954,7 @@
         <w:t xml:space="preserve">, </w:t>
       </w:r>
       <w:r>
-        <w:t>apskaičiavau tikslo ir gradiento funkcijų r</w:t>
+        <w:t xml:space="preserve">apskaičiavau tikslo ir gradiento funkcijų </w:t>
       </w:r>
       <w:r>
         <w:t>reikšmes</w:t>
@@ -3034,7 +3034,7 @@
       </w:pPr>
       <w:r>
         <w:drawing>
-          <wp:inline distT="0" distB="0" distL="0" distR="0" wp14:anchorId="272BF163" wp14:editId="289D3F54">
+          <wp:inline distT="0" distB="0" distL="0" distR="0" wp14:anchorId="272BF163" wp14:editId="33CD526E">
             <wp:extent cx="4410020" cy="3429384"/>
             <wp:effectExtent l="0" t="0" r="0" b="0"/>
             <wp:docPr id="508943313" name="Picture 2"/>
@@ -3123,7 +3123,7 @@
       </w:pPr>
       <w:r>
         <w:drawing>
-          <wp:inline distT="0" distB="0" distL="0" distR="0" wp14:anchorId="1622CF68" wp14:editId="3D134DD2">
+          <wp:inline distT="0" distB="0" distL="0" distR="0" wp14:anchorId="1622CF68" wp14:editId="52842D5E">
             <wp:extent cx="4317012" cy="3357676"/>
             <wp:effectExtent l="0" t="0" r="7620" b="0"/>
             <wp:docPr id="164746977" name="Picture 3"/>
@@ -3215,7 +3215,7 @@
       </w:pPr>
       <w:r>
         <w:drawing>
-          <wp:inline distT="0" distB="0" distL="0" distR="0" wp14:anchorId="6E5402D3" wp14:editId="33CF91A6">
+          <wp:inline distT="0" distB="0" distL="0" distR="0" wp14:anchorId="6E5402D3" wp14:editId="0E75A694">
             <wp:extent cx="4147590" cy="3225902"/>
             <wp:effectExtent l="0" t="0" r="5715" b="0"/>
             <wp:docPr id="89700867" name="Picture 4"/>
@@ -15208,10 +15208,7 @@
           <w:fldChar w:fldCharType="separate"/>
         </w:r>
         <w:r>
-          <w:t>1</w:t>
-        </w:r>
-        <w:r>
-          <w:t>5</w:t>
+          <w:t>15</w:t>
         </w:r>
         <w:r>
           <w:fldChar w:fldCharType="end"/>

</xml_diff>